<commit_message>
Doc: A/B model-fidelity caveat (Claude vs open-weights on adversarial multi-doc packet)
Co-Authored-By: Claude Fable 5 <noreply@anthropic.com>
</commit_message>
<xml_diff>
--- a/docs/Sourcing_Prototype_Overview.docx
+++ b/docs/Sourcing_Prototype_Overview.docx
@@ -2968,6 +2968,24 @@
           <w:szCs w:val="22"/>
         </w:rPr>
         <w:t xml:space="preserve">9.4 Caveats / technical considerations</w:t>
+      </w:r>
+    </w:p>
+    <w:p>
+      <w:pPr>
+        <w:pStyle w:val="ListParagraph"/>
+        <w:numPr>
+          <w:ilvl w:val="0"/>
+          <w:numId w:val="2"/>
+        </w:numPr>
+        <w:spacing w:after="55"/>
+      </w:pPr>
+      <w:r>
+        <w:rPr>
+          <w:color w:val="1F2937"/>
+          <w:sz w:val="21"/>
+          <w:szCs w:val="21"/>
+        </w:rPr>
+        <w:t xml:space="preserve">A/B on the adversarial multi-document packet: the Claude runtime raised 8 exceptions including an award-blocking expired-certificate-vs-questionnaire contradiction; the free open-weights runtime raised none. Hosted deployment is therefore scoped to browsing and text loops — evaluation-grade extraction runs on the Claude runtime.</w:t>
       </w:r>
     </w:p>
     <w:p>

</xml_diff>

<commit_message>
docs: simplify overview language — short plain sentences throughout
Co-Authored-By: Claude Fable 5 <noreply@anthropic.com>
</commit_message>
<xml_diff>
--- a/docs/Sourcing_Prototype_Overview.docx
+++ b/docs/Sourcing_Prototype_Overview.docx
@@ -77,7 +77,7 @@
           <w:sz w:val="21"/>
           <w:szCs w:val="21"/>
         </w:rPr>
-        <w:t xml:space="preserve">Establish a single, evidence-linked source of truth for supplier quotations — regardless of the format suppliers respond in — so that a category buyer can move from five messy replies to a defensible, auditable award decision in minutes instead of days, while being interrupted only for materially important uncertainty.</w:t>
+        <w:t xml:space="preserve">Turn five messy supplier replies into one trusted comparison. Let the buyer award in minutes, not days. Interrupt the buyer only when real money is at stake.</w:t>
       </w:r>
     </w:p>
     <w:p>
@@ -106,7 +106,7 @@
           <w:sz w:val="21"/>
           <w:szCs w:val="21"/>
         </w:rPr>
-        <w:t xml:space="preserve">A category buyer floats an RFQ for 30 corrugated-box SKUs to five suppliers. Responses arrive as: a clean Excel in the supplier's own format, a Word letter with commercials in prose, a PDF whose discount and freight terms hide in footnotes, a photographed rate card shot at an angle, and a two-line email that contradicts its own attachment. Today the buyer re-types everything into a master spreadsheet — losing days — and loses another day every time leadership asks one constrained question.</w:t>
+        <w:t xml:space="preserve">A buyer sends an RFQ for 30 box types to five suppliers. Replies arrive as an Excel, a Word letter, a PDF with terms in footnotes, a photo of a rate card, and an email that contradicts its own attachment. Today the buyer re-types it all into a spreadsheet. That costs days — and every leadership question costs another day.</w:t>
       </w:r>
     </w:p>
     <w:p>
@@ -119,7 +119,7 @@
           <w:sz w:val="21"/>
           <w:szCs w:val="21"/>
         </w:rPr>
-        <w:t xml:space="preserve">The build decouples buyer decision-making from supplier format compliance: suppliers keep replying by email in whatever files they already use, and the system does the adapting. Per the assignment's one rule, the AI loops are real — extraction, normalization planning, and analysis are live model runs, never scripted.</w:t>
+        <w:t xml:space="preserve">This build flips the burden: suppliers reply however they like, and the system adapts. All AI steps are real, live model runs — nothing is scripted.</w:t>
       </w:r>
     </w:p>
     <w:p>
@@ -164,7 +164,7 @@
           <w:sz w:val="21"/>
           <w:szCs w:val="21"/>
         </w:rPr>
-        <w:t xml:space="preserve">Threads across procurement practitioner communities repeat three pains, independent of industry: suppliers rarely comply with bid templates; analysts lose days re-keying quotes into master spreadsheets; and buyers distrust AI-computed totals they cannot trace. These are adoption and trust problems, not parsing problems.</w:t>
+        <w:t xml:space="preserve">Procurement forums repeat three complaints: suppliers ignore bid templates, analysts lose days re-typing quotes, and buyers don't trust AI totals they can't verify. These are trust problems, not parsing problems.</w:t>
       </w:r>
     </w:p>
     <w:p>
@@ -302,27 +302,27 @@
                 <w:sz w:val="19"/>
                 <w:szCs w:val="19"/>
               </w:rPr>
-              <w:t xml:space="preserve">Get clean bid data by forcing structured supplier behaviour (portals, mandatory templates)</w:t>
-            </w:r>
-          </w:p>
-        </w:tc>
-        <w:tc>
-          <w:tcPr>
-            <w:tcW w:type="dxa" w:w="3120"/>
-          </w:tcPr>
-          <w:p>
-            <w:pPr>
-              <w:spacing w:after="40" w:before="0"/>
-            </w:pPr>
-            <w:r>
-              <w:rPr>
-                <w:b w:val="false"/>
-                <w:bCs w:val="false"/>
-                <w:color w:val="1F2937"/>
-                <w:sz w:val="19"/>
-                <w:szCs w:val="19"/>
-              </w:rPr>
-              <w:t xml:space="preserve">Suppliers do not comply; every event pays an adoption tax before evaluation starts</w:t>
+              <w:t xml:space="preserve">Force suppliers into portals and templates</w:t>
+            </w:r>
+          </w:p>
+        </w:tc>
+        <w:tc>
+          <w:tcPr>
+            <w:tcW w:type="dxa" w:w="3120"/>
+          </w:tcPr>
+          <w:p>
+            <w:pPr>
+              <w:spacing w:after="40" w:before="0"/>
+            </w:pPr>
+            <w:r>
+              <w:rPr>
+                <w:b w:val="false"/>
+                <w:bCs w:val="false"/>
+                <w:color w:val="1F2937"/>
+                <w:sz w:val="19"/>
+                <w:szCs w:val="19"/>
+              </w:rPr>
+              <w:t xml:space="preserve">Suppliers don't comply; every event starts with friction</w:t>
             </w:r>
           </w:p>
         </w:tc>
@@ -364,27 +364,27 @@
                 <w:sz w:val="19"/>
                 <w:szCs w:val="19"/>
               </w:rPr>
-              <w:t xml:space="preserve">Automates sourcing events; notably avoids scoring on behalf of human evaluators</w:t>
-            </w:r>
-          </w:p>
-        </w:tc>
-        <w:tc>
-          <w:tcPr>
-            <w:tcW w:type="dxa" w:w="3120"/>
-          </w:tcPr>
-          <w:p>
-            <w:pPr>
-              <w:spacing w:after="40" w:before="0"/>
-            </w:pPr>
-            <w:r>
-              <w:rPr>
-                <w:b w:val="false"/>
-                <w:bCs w:val="false"/>
-                <w:color w:val="1F2937"/>
-                <w:sz w:val="19"/>
-                <w:szCs w:val="19"/>
-              </w:rPr>
-              <w:t xml:space="preserve">Validates the human-gate stance — but does not absorb messy, off-template artifacts</w:t>
+              <w:t xml:space="preserve">Automates sourcing; keeps scoring with humans</w:t>
+            </w:r>
+          </w:p>
+        </w:tc>
+        <w:tc>
+          <w:tcPr>
+            <w:tcW w:type="dxa" w:w="3120"/>
+          </w:tcPr>
+          <w:p>
+            <w:pPr>
+              <w:spacing w:after="40" w:before="0"/>
+            </w:pPr>
+            <w:r>
+              <w:rPr>
+                <w:b w:val="false"/>
+                <w:bCs w:val="false"/>
+                <w:color w:val="1F2937"/>
+                <w:sz w:val="19"/>
+                <w:szCs w:val="19"/>
+              </w:rPr>
+              <w:t xml:space="preserve">Right instinct, but doesn't absorb messy files</w:t>
             </w:r>
           </w:p>
         </w:tc>
@@ -426,27 +426,27 @@
                 <w:sz w:val="19"/>
                 <w:szCs w:val="19"/>
               </w:rPr>
-              <w:t xml:space="preserve">High extraction accuracy on documents</w:t>
-            </w:r>
-          </w:p>
-        </w:tc>
-        <w:tc>
-          <w:tcPr>
-            <w:tcW w:type="dxa" w:w="3120"/>
-          </w:tcPr>
-          <w:p>
-            <w:pPr>
-              <w:spacing w:after="40" w:before="0"/>
-            </w:pPr>
-            <w:r>
-              <w:rPr>
-                <w:b w:val="false"/>
-                <w:bCs w:val="false"/>
-                <w:color w:val="1F2937"/>
-                <w:sz w:val="19"/>
-                <w:szCs w:val="19"/>
-              </w:rPr>
-              <w:t xml:space="preserve">Parsing is not decision-safety: no lineage, no materiality ranking, no governed buyer decisions</w:t>
+              <w:t xml:space="preserve">Read documents accurately</w:t>
+            </w:r>
+          </w:p>
+        </w:tc>
+        <w:tc>
+          <w:tcPr>
+            <w:tcW w:type="dxa" w:w="3120"/>
+          </w:tcPr>
+          <w:p>
+            <w:pPr>
+              <w:spacing w:after="40" w:before="0"/>
+            </w:pPr>
+            <w:r>
+              <w:rPr>
+                <w:b w:val="false"/>
+                <w:bCs w:val="false"/>
+                <w:color w:val="1F2937"/>
+                <w:sz w:val="19"/>
+                <w:szCs w:val="19"/>
+              </w:rPr>
+              <w:t xml:space="preserve">Parsing alone isn't decision-safe: no history, no impact ranking, no buyer control</w:t>
             </w:r>
           </w:p>
         </w:tc>
@@ -493,7 +493,7 @@
           <w:sz w:val="21"/>
           <w:szCs w:val="21"/>
         </w:rPr>
-        <w:t xml:space="preserve">Accept off-template supplier evidence, construct a canonical bid model, preserve lineage, conflicts and transformations, and ask humans only about materially important uncertainty.</w:t>
+        <w:t xml:space="preserve">Accept messy replies. Build one clean bid model that keeps every source, conflict and conversion. Ask the buyer only when the impact is material.</w:t>
       </w:r>
     </w:p>
     <w:p>
@@ -506,7 +506,7 @@
           <w:sz w:val="21"/>
           <w:szCs w:val="21"/>
         </w:rPr>
-        <w:t xml:space="preserve">That thesis fixed the build order before any model was selected: canonical schema and provenance first, agent behaviour in editable markdown second, model choice last — validated per task (vision fidelity for evidence, JSON discipline for resolution) rather than assumed.</w:t>
+        <w:t xml:space="preserve">This fixed the build order: data model first, agent instructions (editable markdown) second, model choice last — each model tested for its task, not assumed.</w:t>
       </w:r>
     </w:p>
     <w:p>
@@ -540,7 +540,7 @@
           <w:sz w:val="21"/>
           <w:szCs w:val="21"/>
         </w:rPr>
-        <w:t xml:space="preserve">Reduce evaluation turnaround from days of re-typing to minutes per supplier response, with zero manual data entry.</w:t>
+        <w:t xml:space="preserve">Days of re-typing become minutes per reply. Zero manual data entry.</w:t>
       </w:r>
     </w:p>
     <w:p>
@@ -558,7 +558,7 @@
           <w:sz w:val="21"/>
           <w:szCs w:val="21"/>
         </w:rPr>
-        <w:t xml:space="preserve">Interrupt the buyer only for material uncertainty — issues are ranked by computed annual ₹ impact, and everything else is handled automatically with a visible audit trail.</w:t>
+        <w:t xml:space="preserve">Issues are ranked by annual ₹ impact. Only material ones reach the buyer; the rest is handled automatically, on an audit trail.</w:t>
       </w:r>
     </w:p>
     <w:p>
@@ -576,7 +576,7 @@
           <w:sz w:val="21"/>
           <w:szCs w:val="21"/>
         </w:rPr>
-        <w:t xml:space="preserve">Consolidate every supplier-facing doubt into a single clarification round per cycle (one reviewed email out, one reply-set in, one recomputation).</w:t>
+        <w:t xml:space="preserve">All supplier questions go out as one email per round. Answers come back in one form. One recompute.</w:t>
       </w:r>
     </w:p>
     <w:p>
@@ -594,7 +594,7 @@
           <w:sz w:val="21"/>
           <w:szCs w:val="21"/>
         </w:rPr>
-        <w:t xml:space="preserve">Make every number defensible: as-quoted value → source excerpt → transformation chain → canonical value, on every cell.</w:t>
+        <w:t xml:space="preserve">Every number is traceable: quoted value → source text → conversion steps → final value.</w:t>
       </w:r>
     </w:p>
     <w:p>
@@ -612,7 +612,7 @@
           <w:sz w:val="21"/>
           <w:szCs w:val="21"/>
         </w:rPr>
-        <w:t xml:space="preserve">Zero supplier adoption cost: no portal, no template, no login — the supplier's inbox is the entire supplier experience.</w:t>
+        <w:t xml:space="preserve">Suppliers adopt nothing: no portal, no template, no login. Their inbox is the whole experience.</w:t>
       </w:r>
     </w:p>
     <w:p>
@@ -656,7 +656,7 @@
           <w:sz w:val="21"/>
           <w:szCs w:val="21"/>
         </w:rPr>
-        <w:t xml:space="preserve">process any reply format on arrival, see the doubts ranked by money at stake, resolve them in one round, and award from a comparison where nothing is silently guessed.</w:t>
+        <w:t xml:space="preserve">process any reply on arrival, see doubts ranked by money, resolve them in one round, award with confidence.</w:t>
       </w:r>
     </w:p>
     <w:p>
@@ -684,7 +684,7 @@
           <w:sz w:val="21"/>
           <w:szCs w:val="21"/>
         </w:rPr>
-        <w:t xml:space="preserve">open the Analysis workspace and see the decision tier at a glance — the recommended split, the cheaper alternative and exactly what blocks it, and the price of the quality gate — with a basis paragraph an auditor can sign off on.</w:t>
+        <w:t xml:space="preserve">see the decision at a glance: the recommended award, the cheaper alternative and what blocks it, and what the quality gate costs.</w:t>
       </w:r>
     </w:p>
     <w:p>
@@ -712,7 +712,7 @@
           <w:sz w:val="21"/>
           <w:szCs w:val="21"/>
         </w:rPr>
-        <w:t xml:space="preserve">deploy and evolve agent behaviour independently of the application: prompts live in editable markdown, models route per-agent in one YAML, and the whole layer swaps between a local Claude runtime and a hosted open-weights runtime with one environment variable.</w:t>
+        <w:t xml:space="preserve">change agent behaviour by editing markdown; swap models per agent in one config file; switch runtimes with one environment variable.</w:t>
       </w:r>
     </w:p>
     <w:p>
@@ -746,7 +746,7 @@
           <w:sz w:val="21"/>
           <w:szCs w:val="21"/>
         </w:rPr>
-        <w:t xml:space="preserve">No supplier-facing portal or app — deliberately, as the core product thesis.</w:t>
+        <w:t xml:space="preserve">No supplier portal or app — by design.</w:t>
       </w:r>
     </w:p>
     <w:p>
@@ -764,7 +764,7 @@
           <w:sz w:val="21"/>
           <w:szCs w:val="21"/>
         </w:rPr>
-        <w:t xml:space="preserve">No autonomous outbound communication: the system detects, consolidates and drafts; the buyer approves and sends every word.</w:t>
+        <w:t xml:space="preserve">No auto-sent messages. The system drafts; the buyer approves every word.</w:t>
       </w:r>
     </w:p>
     <w:p>
@@ -782,7 +782,7 @@
           <w:sz w:val="21"/>
           <w:szCs w:val="21"/>
         </w:rPr>
-        <w:t xml:space="preserve">No auto-award: the award stage is soft-locked behind open decisions, and proceeding requires a recorded waiver.</w:t>
+        <w:t xml:space="preserve">No auto-award. Open decisions block the award unless the buyer records a waiver.</w:t>
       </w:r>
     </w:p>
     <w:p>
@@ -800,7 +800,7 @@
           <w:sz w:val="21"/>
           <w:szCs w:val="21"/>
         </w:rPr>
-        <w:t xml:space="preserve">No ERP/PO integration, reverse auctions, contract management, or production email transport (stubbed per the brief).</w:t>
+        <w:t xml:space="preserve">No ERP, auctions, contracts, or real email transport (stubbed, per the brief).</w:t>
       </w:r>
     </w:p>
     <w:p>
@@ -818,7 +818,7 @@
           <w:sz w:val="21"/>
           <w:szCs w:val="21"/>
         </w:rPr>
-        <w:t xml:space="preserve">No modification of the deterministic calculation layer by any model — models classify and explain; code computes.</w:t>
+        <w:t xml:space="preserve">Models never do the math. Models classify and explain; code computes.</w:t>
       </w:r>
     </w:p>
     <w:p>
@@ -852,7 +852,7 @@
           <w:sz w:val="21"/>
           <w:szCs w:val="21"/>
         </w:rPr>
-        <w:t xml:space="preserve">As a category buyer, I want each supplier reply read on arrival with every doubt gated rather than guessed, so that the comparison I award from contains no invented numbers.</w:t>
+        <w:t xml:space="preserve">As a buyer, I want doubts held back — not guessed — so my comparison has no invented numbers.</w:t>
       </w:r>
     </w:p>
     <w:p>
@@ -870,7 +870,7 @@
           <w:sz w:val="21"/>
           <w:szCs w:val="21"/>
         </w:rPr>
-        <w:t xml:space="preserve">As a category buyer, I want all open questions for a supplier bundled into one drafted email that I review and send, so suppliers get one message instead of ten and I get answers in one pass.</w:t>
+        <w:t xml:space="preserve">As a buyer, I want one drafted email per supplier covering all questions, so I get answers in one pass.</w:t>
       </w:r>
     </w:p>
     <w:p>
@@ -888,7 +888,7 @@
           <w:sz w:val="21"/>
           <w:szCs w:val="21"/>
         </w:rPr>
-        <w:t xml:space="preserve">As a senior executive, I want the recommendation, the blocked alternative, and the cost of our quality gate on one screen, so I can approve without reading cell-level detail.</w:t>
+        <w:t xml:space="preserve">As an executive, I want the recommendation, the alternative, and the cost of the quality gate on one screen.</w:t>
       </w:r>
     </w:p>
     <w:p>
@@ -906,7 +906,7 @@
           <w:sz w:val="21"/>
           <w:szCs w:val="21"/>
         </w:rPr>
-        <w:t xml:space="preserve">As a supplier contact, I want to reply to an RFQ from my inbox in my usual file formats and receive at most one consolidated clarification, so quoting stays effortless.</w:t>
+        <w:t xml:space="preserve">As a supplier, I want to quote from my inbox in my usual files and get at most one follow-up email.</w:t>
       </w:r>
     </w:p>
     <w:p>
@@ -924,7 +924,7 @@
           <w:sz w:val="21"/>
           <w:szCs w:val="21"/>
         </w:rPr>
-        <w:t xml:space="preserve">As an engineer, I want extraction fidelity verified by an automated golden suite against known artifacts, so a model or prompt change is caught before it reaches a buyer.</w:t>
+        <w:t xml:space="preserve">As an engineer, I want an automated test suite that catches any extraction regression before a buyer sees it.</w:t>
       </w:r>
     </w:p>
     <w:p>
@@ -1040,7 +1040,7 @@
                 <w:sz w:val="19"/>
                 <w:szCs w:val="19"/>
               </w:rPr>
-              <w:t xml:space="preserve">Each response format is manually re-keyed into a master spreadsheet; questionnaire answers and attachments are checked by eye, disconnected from the numbers.</w:t>
+              <w:t xml:space="preserve">Every reply is re-typed into a spreadsheet. Questionnaires and attachments are checked by eye, apart from the numbers.</w:t>
             </w:r>
           </w:p>
         </w:tc>
@@ -1082,7 +1082,7 @@
                 <w:sz w:val="19"/>
                 <w:szCs w:val="19"/>
               </w:rPr>
-              <w:t xml:space="preserve">Unit ambiguity (per-piece vs per-100 vs per-case vs ₹/kg), currency mixing, ex-works vs delivered basis, conditional discounts, internal contradictions, illegible cells, and unquoted lines — all invisible once flattened into one sheet.</w:t>
+              <w:t xml:space="preserve">Mixed units (per piece / per 100 / per case / ₹ per kg), mixed currencies, freight differences, conditional discounts, contradictions, unreadable cells, missing lines — all invisible once flattened into one sheet.</w:t>
             </w:r>
           </w:p>
         </w:tc>
@@ -1124,7 +1124,7 @@
                 <w:sz w:val="19"/>
                 <w:szCs w:val="19"/>
               </w:rPr>
-              <w:t xml:space="preserve">A case-pack rate with an unstated pack size can misprice 18 of 30 lines; an expired ISO certificate clears a gate if only the questionnaire is read; an email's freight claim contradicts its own attachment and one side gets silently chosen.</w:t>
+              <w:t xml:space="preserve">An unstated pack size can misprice 18 of 30 lines. An expired certificate slips through if only the questionnaire is read. An email contradicts its own attachment and one side gets silently chosen.</w:t>
             </w:r>
           </w:p>
         </w:tc>
@@ -1166,7 +1166,7 @@
                 <w:sz w:val="19"/>
                 <w:szCs w:val="19"/>
               </w:rPr>
-              <w:t xml:space="preserve">Three-plus days lost to re-typing per event; one additional day per leadership scenario question; award decisions on crores of spend resting on un-audited transformations.</w:t>
+              <w:t xml:space="preserve">3+ days lost per event. One more day per leadership question. Crores awarded on un-audited numbers.</w:t>
             </w:r>
           </w:p>
         </w:tc>
@@ -1606,7 +1606,7 @@
           <w:sz w:val="21"/>
           <w:szCs w:val="21"/>
         </w:rPr>
-        <w:t xml:space="preserve">Observation: every non-confirmed cell carries its reason and its evidence; the 18 gated cells collapse into a single buyer decision (one smudged case-pack factor). Extraction fidelity is verified by a 40-assertion golden suite — currently 40/40.</w:t>
+        <w:t xml:space="preserve">Every uncertain cell shows its reason and evidence. The 18 held cells trace to one question — a smudged pack size. A 40-check test suite verifies extraction: currently 40/40.</w:t>
       </w:r>
     </w:p>
     <w:p>
@@ -1738,7 +1738,7 @@
                 <w:sz w:val="19"/>
                 <w:szCs w:val="19"/>
               </w:rPr>
-              <w:t xml:space="preserve">Three-agent pipeline (evidence → resolution → analyst) with deterministic execution of every conversion; canonical bid model with per-cell provenance chains; materiality-ranked exceptions; single-round clarifications with batch reply capture; standing rules promoted from repeated decisions; supplier-wise audit timeline; executive decision tier; soft-locked award with waivers; golden test suite; dual runtime (local Claude subscription / hosted open-weights) and a public deployment.</w:t>
+              <w:t xml:space="preserve">Three agents (read → classify → explain) with code doing all math. One bid model with per-cell history. Issues ranked by ₹ impact. One-email clarification rounds. Standing rules from repeated decisions. Audit timeline, executive view, soft-locked award. Test suite, dual runtime, public deployment.</w:t>
             </w:r>
           </w:p>
         </w:tc>
@@ -1780,7 +1780,7 @@
                 <w:sz w:val="19"/>
                 <w:szCs w:val="19"/>
               </w:rPr>
-              <w:t xml:space="preserve">Parallel per-supplier fan-out (whole inbox in ~2–3 min); prior-year baseline ingestion so savings claims are evidence-backed rather than refused; per-tenant event state; mandatory-line flags on the RFx; configurable auto-send rules for low-risk clarifications; richer spec completeness in the canonical ask (the GSM-deviation lesson from adversarial testing).</w:t>
+              <w:t xml:space="preserve">Process all suppliers in parallel (~3 min per inbox). Ingest last year's prices so savings claims have a baseline. Multi-tenant state. Mandatory-line flags. Optional auto-send for low-risk questions. Fuller specs in the ask (a lesson from testing).</w:t>
             </w:r>
           </w:p>
         </w:tc>
@@ -1976,7 +1976,7 @@
                 <w:sz w:val="19"/>
                 <w:szCs w:val="19"/>
               </w:rPr>
-              <w:t xml:space="preserve">Read correctly; smudged cells returned null</w:t>
+              <w:t xml:space="preserve">Read correctly; smudged cells left blank</w:t>
             </w:r>
           </w:p>
         </w:tc>
@@ -2058,7 +2058,7 @@
                 <w:sz w:val="19"/>
                 <w:szCs w:val="19"/>
               </w:rPr>
-              <w:t xml:space="preserve">Confident row misalignment</w:t>
+              <w:t xml:space="preserve">Read the wrong row, confidently</w:t>
             </w:r>
           </w:p>
         </w:tc>
@@ -2140,7 +2140,7 @@
                 <w:sz w:val="19"/>
                 <w:szCs w:val="19"/>
               </w:rPr>
-              <w:t xml:space="preserve">Uncertain values are gated, never guessed; hosted vision disabled by default</w:t>
+              <w:t xml:space="preserve">Uncertain values are held, never guessed; hosted photo-reading is off</w:t>
             </w:r>
           </w:p>
         </w:tc>
@@ -2160,7 +2160,7 @@
                 <w:sz w:val="19"/>
                 <w:szCs w:val="19"/>
               </w:rPr>
-              <w:t xml:space="preserve">No invented number can reach an award</w:t>
+              <w:t xml:space="preserve">No invented number can reach the award</w:t>
             </w:r>
           </w:p>
         </w:tc>
@@ -2176,7 +2176,7 @@
           <w:sz w:val="21"/>
           <w:szCs w:val="21"/>
         </w:rPr>
-        <w:t xml:space="preserve">The same policy governs everything: a range quote gates, an unstated pack factor gates, an illegible cell gates, a contradiction surfaces both sides. One confirmed fact from the buyer re-runs resolution live with the decision stamped into every affected chain.</w:t>
+        <w:t xml:space="preserve">The same rule everywhere: a price range holds, an unknown pack size holds, an unreadable cell holds, a contradiction shows both sides. One confirmed fact from the buyer recomputes everything, on the record.</w:t>
       </w:r>
     </w:p>
     <w:p>
@@ -2314,27 +2314,27 @@
                 <w:sz w:val="19"/>
                 <w:szCs w:val="19"/>
               </w:rPr>
-              <w:t xml:space="preserve">Drafts and amends the ask conversationally; human approves every send</w:t>
-            </w:r>
-          </w:p>
-        </w:tc>
-        <w:tc>
-          <w:tcPr>
-            <w:tcW w:type="dxa" w:w="3120"/>
-          </w:tcPr>
-          <w:p>
-            <w:pPr>
-              <w:spacing w:after="40" w:before="0"/>
-            </w:pPr>
-            <w:r>
-              <w:rPr>
-                <w:b w:val="false"/>
-                <w:bCs w:val="false"/>
-                <w:color w:val="1F2937"/>
-                <w:sz w:val="19"/>
-                <w:szCs w:val="19"/>
-              </w:rPr>
-              <w:t xml:space="preserve">The ask is shaped in minutes and stays under buyer control</w:t>
+              <w:t xml:space="preserve">Drafts and edits the ask by chat; buyer approves everything</w:t>
+            </w:r>
+          </w:p>
+        </w:tc>
+        <w:tc>
+          <w:tcPr>
+            <w:tcW w:type="dxa" w:w="3120"/>
+          </w:tcPr>
+          <w:p>
+            <w:pPr>
+              <w:spacing w:after="40" w:before="0"/>
+            </w:pPr>
+            <w:r>
+              <w:rPr>
+                <w:b w:val="false"/>
+                <w:bCs w:val="false"/>
+                <w:color w:val="1F2937"/>
+                <w:sz w:val="19"/>
+                <w:szCs w:val="19"/>
+              </w:rPr>
+              <w:t xml:space="preserve">The ask takes minutes and stays under buyer control</w:t>
             </w:r>
           </w:p>
         </w:tc>
@@ -2376,27 +2376,27 @@
                 <w:sz w:val="19"/>
                 <w:szCs w:val="19"/>
               </w:rPr>
-              <w:t xml:space="preserve">Reads any format (photos included locally); verbatim values with source locators; reports conflicts and gaps</w:t>
-            </w:r>
-          </w:p>
-        </w:tc>
-        <w:tc>
-          <w:tcPr>
-            <w:tcW w:type="dxa" w:w="3120"/>
-          </w:tcPr>
-          <w:p>
-            <w:pPr>
-              <w:spacing w:after="40" w:before="0"/>
-            </w:pPr>
-            <w:r>
-              <w:rPr>
-                <w:b w:val="false"/>
-                <w:bCs w:val="false"/>
-                <w:color w:val="1F2937"/>
-                <w:sz w:val="19"/>
-                <w:szCs w:val="19"/>
-              </w:rPr>
-              <w:t xml:space="preserve">Zero re-typing; nothing invented — illegible means null</w:t>
+              <w:t xml:space="preserve">Reads any format, photos included. Keeps exact values with their source. Reports conflicts and gaps</w:t>
+            </w:r>
+          </w:p>
+        </w:tc>
+        <w:tc>
+          <w:tcPr>
+            <w:tcW w:type="dxa" w:w="3120"/>
+          </w:tcPr>
+          <w:p>
+            <w:pPr>
+              <w:spacing w:after="40" w:before="0"/>
+            </w:pPr>
+            <w:r>
+              <w:rPr>
+                <w:b w:val="false"/>
+                <w:bCs w:val="false"/>
+                <w:color w:val="1F2937"/>
+                <w:sz w:val="19"/>
+                <w:szCs w:val="19"/>
+              </w:rPr>
+              <w:t xml:space="preserve">No re-typing. Nothing invented — unreadable stays blank</w:t>
             </w:r>
           </w:p>
         </w:tc>
@@ -2438,27 +2438,27 @@
                 <w:sz w:val="19"/>
                 <w:szCs w:val="19"/>
               </w:rPr>
-              <w:t xml:space="preserve">Model classifies each line's path to ₹/piece; code performs every conversion and prices every doubt</w:t>
-            </w:r>
-          </w:p>
-        </w:tc>
-        <w:tc>
-          <w:tcPr>
-            <w:tcW w:type="dxa" w:w="3120"/>
-          </w:tcPr>
-          <w:p>
-            <w:pPr>
-              <w:spacing w:after="40" w:before="0"/>
-            </w:pPr>
-            <w:r>
-              <w:rPr>
-                <w:b w:val="false"/>
-                <w:bCs w:val="false"/>
-                <w:color w:val="1F2937"/>
-                <w:sz w:val="19"/>
-                <w:szCs w:val="19"/>
-              </w:rPr>
-              <w:t xml:space="preserve">Comparable numbers with an audit chain; interruptions ranked by money at stake</w:t>
+              <w:t xml:space="preserve">Model picks each line's conversion; code does the math and prices every doubt</w:t>
+            </w:r>
+          </w:p>
+        </w:tc>
+        <w:tc>
+          <w:tcPr>
+            <w:tcW w:type="dxa" w:w="3120"/>
+          </w:tcPr>
+          <w:p>
+            <w:pPr>
+              <w:spacing w:after="40" w:before="0"/>
+            </w:pPr>
+            <w:r>
+              <w:rPr>
+                <w:b w:val="false"/>
+                <w:bCs w:val="false"/>
+                <w:color w:val="1F2937"/>
+                <w:sz w:val="19"/>
+                <w:szCs w:val="19"/>
+              </w:rPr>
+              <w:t xml:space="preserve">Comparable numbers with full history; interruptions ranked by money</w:t>
             </w:r>
           </w:p>
         </w:tc>
@@ -2500,27 +2500,27 @@
                 <w:sz w:val="19"/>
                 <w:szCs w:val="19"/>
               </w:rPr>
-              <w:t xml:space="preserve">Every supplier-facing doubt batched into one reviewed email; replies captured in one form</w:t>
-            </w:r>
-          </w:p>
-        </w:tc>
-        <w:tc>
-          <w:tcPr>
-            <w:tcW w:type="dxa" w:w="3120"/>
-          </w:tcPr>
-          <w:p>
-            <w:pPr>
-              <w:spacing w:after="40" w:before="0"/>
-            </w:pPr>
-            <w:r>
-              <w:rPr>
-                <w:b w:val="false"/>
-                <w:bCs w:val="false"/>
-                <w:color w:val="1F2937"/>
-                <w:sz w:val="19"/>
-                <w:szCs w:val="19"/>
-              </w:rPr>
-              <w:t xml:space="preserve">Two touchpoints per supplier per cycle — and suppliers get one email, not ten</w:t>
+              <w:t xml:space="preserve">All questions in one reviewed email; all answers in one form</w:t>
+            </w:r>
+          </w:p>
+        </w:tc>
+        <w:tc>
+          <w:tcPr>
+            <w:tcW w:type="dxa" w:w="3120"/>
+          </w:tcPr>
+          <w:p>
+            <w:pPr>
+              <w:spacing w:after="40" w:before="0"/>
+            </w:pPr>
+            <w:r>
+              <w:rPr>
+                <w:b w:val="false"/>
+                <w:bCs w:val="false"/>
+                <w:color w:val="1F2937"/>
+                <w:sz w:val="19"/>
+                <w:szCs w:val="19"/>
+              </w:rPr>
+              <w:t xml:space="preserve">Two buyer touchpoints. Suppliers get one email, not ten</w:t>
             </w:r>
           </w:p>
         </w:tc>
@@ -2562,27 +2562,27 @@
                 <w:sz w:val="19"/>
                 <w:szCs w:val="19"/>
               </w:rPr>
-              <w:t xml:space="preserve">Repeated decisions promoted to governed policy, stamped on every cell they touch</w:t>
-            </w:r>
-          </w:p>
-        </w:tc>
-        <w:tc>
-          <w:tcPr>
-            <w:tcW w:type="dxa" w:w="3120"/>
-          </w:tcPr>
-          <w:p>
-            <w:pPr>
-              <w:spacing w:after="40" w:before="0"/>
-            </w:pPr>
-            <w:r>
-              <w:rPr>
-                <w:b w:val="false"/>
-                <w:bCs w:val="false"/>
-                <w:color w:val="1F2937"/>
-                <w:sz w:val="19"/>
-                <w:szCs w:val="19"/>
-              </w:rPr>
-              <w:t xml:space="preserve">Interruptions shrink over time; automation stays visible, never silent</w:t>
+              <w:t xml:space="preserve">Repeated decisions become rules, stamped wherever applied</w:t>
+            </w:r>
+          </w:p>
+        </w:tc>
+        <w:tc>
+          <w:tcPr>
+            <w:tcW w:type="dxa" w:w="3120"/>
+          </w:tcPr>
+          <w:p>
+            <w:pPr>
+              <w:spacing w:after="40" w:before="0"/>
+            </w:pPr>
+            <w:r>
+              <w:rPr>
+                <w:b w:val="false"/>
+                <w:bCs w:val="false"/>
+                <w:color w:val="1F2937"/>
+                <w:sz w:val="19"/>
+                <w:szCs w:val="19"/>
+              </w:rPr>
+              <w:t xml:space="preserve">Fewer interruptions over time; automation stays visible</w:t>
             </w:r>
           </w:p>
         </w:tc>
@@ -2624,27 +2624,27 @@
                 <w:sz w:val="19"/>
                 <w:szCs w:val="19"/>
               </w:rPr>
-              <w:t xml:space="preserve">One basis; per-cell chain of custody; gaps never ₹0</w:t>
-            </w:r>
-          </w:p>
-        </w:tc>
-        <w:tc>
-          <w:tcPr>
-            <w:tcW w:type="dxa" w:w="3120"/>
-          </w:tcPr>
-          <w:p>
-            <w:pPr>
-              <w:spacing w:after="40" w:before="0"/>
-            </w:pPr>
-            <w:r>
-              <w:rPr>
-                <w:b w:val="false"/>
-                <w:bCs w:val="false"/>
-                <w:color w:val="1F2937"/>
-                <w:sz w:val="19"/>
-                <w:szCs w:val="19"/>
-              </w:rPr>
-              <w:t xml:space="preserve">Any number defended in under five seconds</w:t>
+              <w:t xml:space="preserve">One basis. Every cell traceable. Gaps never become ₹0</w:t>
+            </w:r>
+          </w:p>
+        </w:tc>
+        <w:tc>
+          <w:tcPr>
+            <w:tcW w:type="dxa" w:w="3120"/>
+          </w:tcPr>
+          <w:p>
+            <w:pPr>
+              <w:spacing w:after="40" w:before="0"/>
+            </w:pPr>
+            <w:r>
+              <w:rPr>
+                <w:b w:val="false"/>
+                <w:bCs w:val="false"/>
+                <w:color w:val="1F2937"/>
+                <w:sz w:val="19"/>
+                <w:szCs w:val="19"/>
+              </w:rPr>
+              <w:t xml:space="preserve">Any number defended in five seconds</w:t>
             </w:r>
           </w:p>
         </w:tc>
@@ -2686,27 +2686,27 @@
                 <w:sz w:val="19"/>
                 <w:szCs w:val="19"/>
               </w:rPr>
-              <w:t xml:space="preserve">Plan → compute → explain with a basis paragraph; decision tier at a glance</w:t>
-            </w:r>
-          </w:p>
-        </w:tc>
-        <w:tc>
-          <w:tcPr>
-            <w:tcW w:type="dxa" w:w="3120"/>
-          </w:tcPr>
-          <w:p>
-            <w:pPr>
-              <w:spacing w:after="40" w:before="0"/>
-            </w:pPr>
-            <w:r>
-              <w:rPr>
-                <w:b w:val="false"/>
-                <w:bCs w:val="false"/>
-                <w:color w:val="1F2937"/>
-                <w:sz w:val="19"/>
-                <w:szCs w:val="19"/>
-              </w:rPr>
-              <w:t xml:space="preserve">Leadership approves from one screen; totals cannot be hallucinated</w:t>
+              <w:t xml:space="preserve">Plans queries, code computes, model explains — with its basis</w:t>
+            </w:r>
+          </w:p>
+        </w:tc>
+        <w:tc>
+          <w:tcPr>
+            <w:tcW w:type="dxa" w:w="3120"/>
+          </w:tcPr>
+          <w:p>
+            <w:pPr>
+              <w:spacing w:after="40" w:before="0"/>
+            </w:pPr>
+            <w:r>
+              <w:rPr>
+                <w:b w:val="false"/>
+                <w:bCs w:val="false"/>
+                <w:color w:val="1F2937"/>
+                <w:sz w:val="19"/>
+                <w:szCs w:val="19"/>
+              </w:rPr>
+              <w:t xml:space="preserve">Leadership approves from one screen; totals can't be made up</w:t>
             </w:r>
           </w:p>
         </w:tc>
@@ -2748,27 +2748,27 @@
                 <w:sz w:val="19"/>
                 <w:szCs w:val="19"/>
               </w:rPr>
-              <w:t xml:space="preserve">Soft-locked award, recorded waivers, timestamped supplier-wise trail</w:t>
-            </w:r>
-          </w:p>
-        </w:tc>
-        <w:tc>
-          <w:tcPr>
-            <w:tcW w:type="dxa" w:w="3120"/>
-          </w:tcPr>
-          <w:p>
-            <w:pPr>
-              <w:spacing w:after="40" w:before="0"/>
-            </w:pPr>
-            <w:r>
-              <w:rPr>
-                <w:b w:val="false"/>
-                <w:bCs w:val="false"/>
-                <w:color w:val="1F2937"/>
-                <w:sz w:val="19"/>
-                <w:szCs w:val="19"/>
-              </w:rPr>
-              <w:t xml:space="preserve">A crores-level decision that carries its own defence</w:t>
+              <w:t xml:space="preserve">Award locks until decisions are done, or a waiver is recorded</w:t>
+            </w:r>
+          </w:p>
+        </w:tc>
+        <w:tc>
+          <w:tcPr>
+            <w:tcW w:type="dxa" w:w="3120"/>
+          </w:tcPr>
+          <w:p>
+            <w:pPr>
+              <w:spacing w:after="40" w:before="0"/>
+            </w:pPr>
+            <w:r>
+              <w:rPr>
+                <w:b w:val="false"/>
+                <w:bCs w:val="false"/>
+                <w:color w:val="1F2937"/>
+                <w:sz w:val="19"/>
+                <w:szCs w:val="19"/>
+              </w:rPr>
+              <w:t xml:space="preserve">A crores-level decision that defends itself</w:t>
             </w:r>
           </w:p>
         </w:tc>
@@ -2831,7 +2831,7 @@
           <w:sz w:val="18"/>
           <w:szCs w:val="18"/>
         </w:rPr>
-        <w:t xml:space="preserve">Comparison workspace: one basis, best-price highlights, held-out doubts excluded from totals, live analyst rail.</w:t>
+        <w:t xml:space="preserve">Comparison: one basis, best prices highlighted, doubts kept out of totals.</w:t>
       </w:r>
     </w:p>
     <w:p>
@@ -2891,7 +2891,7 @@
           <w:sz w:val="18"/>
           <w:szCs w:val="18"/>
         </w:rPr>
-        <w:t xml:space="preserve">Supplier review: live processing, doubts ranked with ₹ impact, one-email clarification round, supplier-wise audit timeline.</w:t>
+        <w:t xml:space="preserve">Supplier review: live processing, ranked doubts, one-email round, audit timeline.</w:t>
       </w:r>
     </w:p>
     <w:p>
@@ -2951,7 +2951,7 @@
           <w:sz w:val="18"/>
           <w:szCs w:val="18"/>
         </w:rPr>
-        <w:t xml:space="preserve">Analysis workspace: the executive decision tier — the choice, the blocked alternative, and the price of the quality gate.</w:t>
+        <w:t xml:space="preserve">Analysis: the choice, the blocked alternative, and the cost of the quality gate.</w:t>
       </w:r>
     </w:p>
     <w:p>
@@ -2985,7 +2985,7 @@
           <w:sz w:val="21"/>
           <w:szCs w:val="21"/>
         </w:rPr>
-        <w:t xml:space="preserve">A/B on the adversarial multi-document packet: the Claude runtime raised 8 exceptions including an award-blocking expired-certificate-vs-questionnaire contradiction; the free open-weights runtime raised none. Hosted deployment is therefore scoped to browsing and text loops — evaluation-grade extraction runs on the Claude runtime.</w:t>
+        <w:t xml:space="preserve">Same hard test pack, two models: Claude raised 8 issues — including an expired certificate contradicting the questionnaire. The free model raised none. So the hosted demo covers browsing and text actions; full-fidelity extraction runs on Claude.</w:t>
       </w:r>
     </w:p>
     <w:p>
@@ -3003,7 +3003,7 @@
           <w:sz w:val="21"/>
           <w:szCs w:val="21"/>
         </w:rPr>
-        <w:t xml:space="preserve">Hosted demo runs on a free open-weights model (gpt-oss:120b) for live text loops; pre-processed results in the shipped snapshot were produced by Claude. Vision is disabled on the hosted instance by design (see 8.2).</w:t>
+        <w:t xml:space="preserve">The hosted demo uses a free open model for live text actions. The pre-loaded results were produced by Claude. Photo-reading is off on the hosted demo (see 9.2).</w:t>
       </w:r>
     </w:p>
     <w:p>
@@ -3021,7 +3021,7 @@
           <w:sz w:val="21"/>
           <w:szCs w:val="21"/>
         </w:rPr>
-        <w:t xml:space="preserve">The free hosting tier sleeps when idle (first visit takes ~60 s) and has an ephemeral disk — the demo self-resets to its verified opening state.</w:t>
+        <w:t xml:space="preserve">The free host sleeps when idle (first visit ~60 s) and resets itself to a clean state.</w:t>
       </w:r>
     </w:p>
     <w:p>
@@ -3039,7 +3039,7 @@
           <w:sz w:val="21"/>
           <w:szCs w:val="21"/>
         </w:rPr>
-        <w:t xml:space="preserve">Single-tenant by design for the prototype; per-tenant state is a Phase 2 item.</w:t>
+        <w:t xml:space="preserve">One shared event for the prototype; multi-tenant is Phase 2.</w:t>
       </w:r>
     </w:p>
     <w:p>
@@ -3089,7 +3089,7 @@
           <w:sz w:val="21"/>
           <w:szCs w:val="21"/>
         </w:rPr>
-        <w:t xml:space="preserve">Turnaround: one supplier response processed in 2–4 minutes; a buyer decision recomputes the comparison in ~2 minutes; an analyst answer with basis in 2–4 minutes.</w:t>
+        <w:t xml:space="preserve">One reply processed in 2–4 minutes. A decision recomputes in ~2. An analyst answer in 2–4.</w:t>
       </w:r>
     </w:p>
     <w:p>
@@ -3107,7 +3107,7 @@
           <w:sz w:val="21"/>
           <w:szCs w:val="21"/>
         </w:rPr>
-        <w:t xml:space="preserve">Zero invented numbers: verified by the golden suite (40/40) and adversarial packs (hostile Excel, multi-document contradictions, unreadable files → honest refusal, never a crash).</w:t>
+        <w:t xml:space="preserve">Zero invented numbers — verified by the test suite (40/40) and adversarial files (unreadable input gets an honest refusal, never a crash).</w:t>
       </w:r>
     </w:p>
     <w:p>
@@ -3125,7 +3125,7 @@
           <w:sz w:val="21"/>
           <w:szCs w:val="21"/>
         </w:rPr>
-        <w:t xml:space="preserve">Clarification efficiency: N doubts per supplier become one email out and one reply-set in — two buyer touchpoints per cycle.</w:t>
+        <w:t xml:space="preserve">Any number of doubts per supplier = one email out, one reply-set in. Two buyer touchpoints.</w:t>
       </w:r>
     </w:p>
     <w:p>
@@ -3143,7 +3143,7 @@
           <w:sz w:val="21"/>
           <w:szCs w:val="21"/>
         </w:rPr>
-        <w:t xml:space="preserve">Defensibility: every award figure traces to supplier ink through an audited transformation chain, with decisions, rounds and rules on a timestamped trail.</w:t>
+        <w:t xml:space="preserve">Every award figure traces back to the supplier's own document, step by step, on a timestamped trail.</w:t>
       </w:r>
     </w:p>
     <w:p>
@@ -3177,7 +3177,7 @@
           <w:sz w:val="21"/>
           <w:szCs w:val="21"/>
         </w:rPr>
-        <w:t xml:space="preserve">Standing rules compound buyer decisions into governed policy, shrinking future rounds automatically.</w:t>
+        <w:t xml:space="preserve">Repeated decisions become standing rules — future rounds shrink automatically.</w:t>
       </w:r>
     </w:p>
     <w:p>
@@ -3195,7 +3195,7 @@
           <w:sz w:val="21"/>
           <w:szCs w:val="21"/>
         </w:rPr>
-        <w:t xml:space="preserve">The executive tier turns the comparison into a one-glance decision: the choice, the blocked alternative, and the price of staying safe.</w:t>
+        <w:t xml:space="preserve">Executives get a one-glance decision: the choice, the alternative, and the cost of staying safe.</w:t>
       </w:r>
     </w:p>
     <w:p>
@@ -3213,7 +3213,7 @@
           <w:sz w:val="21"/>
           <w:szCs w:val="21"/>
         </w:rPr>
-        <w:t xml:space="preserve">Provider-agnostic architecture demonstrated in production: local Claude runtime and hosted open-weights runtime, swapped by one environment variable.</w:t>
+        <w:t xml:space="preserve">Model-agnostic in practice: Claude locally, an open model hosted — swapped with one variable.</w:t>
       </w:r>
     </w:p>
     <w:p>

</xml_diff>